<commit_message>
Update supplementary materials I - summary stats from previous articles.docx
added 2015 quotes
</commit_message>
<xml_diff>
--- a/communication/preprint/supplementary materials I - summary stats from previous articles.docx
+++ b/communication/preprint/supplementary materials I - summary stats from previous articles.docx
@@ -1,44 +1,16 @@
 
 <file path=word/document.xml><?xml version="1.0" encoding="utf-8"?>
-<w:document xmlns:wpc="http://schemas.microsoft.com/office/word/2010/wordprocessingCanvas" xmlns:cx="http://schemas.microsoft.com/office/drawing/2014/chartex" xmlns:cx1="http://schemas.microsoft.com/office/drawing/2015/9/8/chartex" xmlns:cx2="http://schemas.microsoft.com/office/drawing/2015/10/21/chartex" xmlns:cx3="http://schemas.microsoft.com/office/drawing/2016/5/9/chartex" xmlns:cx4="http://schemas.microsoft.com/office/drawing/2016/5/10/chartex" xmlns:cx5="http://schemas.microsoft.com/office/drawing/2016/5/11/chartex" xmlns:cx6="http://schemas.microsoft.com/office/drawing/2016/5/12/chartex" xmlns:cx7="http://schemas.microsoft.com/office/drawing/2016/5/13/chartex" xmlns:cx8="http://schemas.microsoft.com/office/drawing/2016/5/14/chartex" xmlns:mc="http://schemas.openxmlformats.org/markup-compatibility/2006" xmlns:aink="http://schemas.microsoft.com/office/drawing/2016/ink" xmlns:am3d="http://schemas.microsoft.com/office/drawing/2017/model3d" xmlns:o="urn:schemas-microsoft-com:office:office" xmlns:oel="http://schemas.microsoft.com/office/2019/extlst" xmlns:r="http://schemas.openxmlformats.org/officeDocument/2006/relationships" xmlns:m="http://schemas.openxmlformats.org/officeDocument/2006/math" xmlns:v="urn:schemas-microsoft-com:vml" xmlns:wp14="http://schemas.microsoft.com/office/word/2010/wordprocessingDrawing" xmlns:wp="http://schemas.openxmlformats.org/drawingml/2006/wordprocessingDrawing" xmlns:w10="urn:schemas-microsoft-com:office:word" xmlns:w="http://schemas.openxmlformats.org/wordprocessingml/2006/main" xmlns:w14="http://schemas.microsoft.com/office/word/2010/wordml" xmlns:w15="http://schemas.microsoft.com/office/word/2012/wordml" xmlns:w16cex="http://schemas.microsoft.com/office/word/2018/wordml/cex" xmlns:w16cid="http://schemas.microsoft.com/office/word/2016/wordml/cid" xmlns:w16="http://schemas.microsoft.com/office/word/2018/wordml" xmlns:w16sdtdh="http://schemas.microsoft.com/office/word/2020/wordml/sdtdatahash" xmlns:w16se="http://schemas.microsoft.com/office/word/2015/wordml/symex" xmlns:wpg="http://schemas.microsoft.com/office/word/2010/wordprocessingGroup" xmlns:wpi="http://schemas.microsoft.com/office/word/2010/wordprocessingInk" xmlns:wne="http://schemas.microsoft.com/office/word/2006/wordml" xmlns:wps="http://schemas.microsoft.com/office/word/2010/wordprocessingShape" mc:Ignorable="w14 w15 w16se w16cid w16 w16cex w16sdtdh wp14">
+<w:document xmlns:wpc="http://schemas.microsoft.com/office/word/2010/wordprocessingCanvas" xmlns:cx="http://schemas.microsoft.com/office/drawing/2014/chartex" xmlns:cx1="http://schemas.microsoft.com/office/drawing/2015/9/8/chartex" xmlns:cx2="http://schemas.microsoft.com/office/drawing/2015/10/21/chartex" xmlns:cx3="http://schemas.microsoft.com/office/drawing/2016/5/9/chartex" xmlns:cx4="http://schemas.microsoft.com/office/drawing/2016/5/10/chartex" xmlns:cx5="http://schemas.microsoft.com/office/drawing/2016/5/11/chartex" xmlns:cx6="http://schemas.microsoft.com/office/drawing/2016/5/12/chartex" xmlns:cx7="http://schemas.microsoft.com/office/drawing/2016/5/13/chartex" xmlns:cx8="http://schemas.microsoft.com/office/drawing/2016/5/14/chartex" xmlns:mc="http://schemas.openxmlformats.org/markup-compatibility/2006" xmlns:aink="http://schemas.microsoft.com/office/drawing/2016/ink" xmlns:am3d="http://schemas.microsoft.com/office/drawing/2017/model3d" xmlns:o="urn:schemas-microsoft-com:office:office" xmlns:oel="http://schemas.microsoft.com/office/2019/extlst" xmlns:r="http://schemas.openxmlformats.org/officeDocument/2006/relationships" xmlns:m="http://schemas.openxmlformats.org/officeDocument/2006/math" xmlns:v="urn:schemas-microsoft-com:vml" xmlns:wp14="http://schemas.microsoft.com/office/word/2010/wordprocessingDrawing" xmlns:wp="http://schemas.openxmlformats.org/drawingml/2006/wordprocessingDrawing" xmlns:w10="urn:schemas-microsoft-com:office:word" xmlns:w="http://schemas.openxmlformats.org/wordprocessingml/2006/main" xmlns:w14="http://schemas.microsoft.com/office/word/2010/wordml" xmlns:w15="http://schemas.microsoft.com/office/word/2012/wordml" xmlns:w16cex="http://schemas.microsoft.com/office/word/2018/wordml/cex" xmlns:w16cid="http://schemas.microsoft.com/office/word/2016/wordml/cid" xmlns:w16="http://schemas.microsoft.com/office/word/2018/wordml" xmlns:w16du="http://schemas.microsoft.com/office/word/2023/wordml/word16du" xmlns:w16sdtdh="http://schemas.microsoft.com/office/word/2020/wordml/sdtdatahash" xmlns:w16sdtfl="http://schemas.microsoft.com/office/word/2024/wordml/sdtformatlock" xmlns:w16se="http://schemas.microsoft.com/office/word/2015/wordml/symex" xmlns:wpg="http://schemas.microsoft.com/office/word/2010/wordprocessingGroup" xmlns:wpi="http://schemas.microsoft.com/office/word/2010/wordprocessingInk" xmlns:wne="http://schemas.microsoft.com/office/word/2006/wordml" xmlns:wps="http://schemas.microsoft.com/office/word/2010/wordprocessingShape" mc:Ignorable="w14 w15 w16se w16cid w16 w16cex w16sdtdh w16sdtfl w16du wp14">
   <w:body>
     <w:p>
       <w:pPr>
         <w:pStyle w:val="Heading1"/>
       </w:pPr>
       <w:r>
-        <w:t xml:space="preserve">M and SD from previous studies </w:t>
-      </w:r>
-    </w:p>
-    <w:p>
-      <w:pPr>
-        <w:pStyle w:val="Heading1"/>
-      </w:pPr>
-    </w:p>
-    <w:p>
-      <w:pPr>
-        <w:pStyle w:val="Heading1"/>
-      </w:pPr>
-    </w:p>
-    <w:p>
-      <w:pPr>
-        <w:pStyle w:val="Heading1"/>
-      </w:pPr>
-    </w:p>
-    <w:p>
-      <w:pPr>
-        <w:pStyle w:val="Heading1"/>
-      </w:pPr>
-    </w:p>
-    <w:p>
-      <w:pPr>
-        <w:pStyle w:val="Heading1"/>
-      </w:pPr>
-      <w:r>
-        <w:t>Key quot</w:t>
-      </w:r>
-      <w:r>
-        <w:t>es</w:t>
+        <w:t xml:space="preserve">Key </w:t>
+      </w:r>
+      <w:r>
+        <w:t>results</w:t>
       </w:r>
     </w:p>
     <w:p>
@@ -49,7 +21,16 @@
         <w:t>rimary outcome measures</w:t>
       </w:r>
       <w:r>
-        <w:t xml:space="preserve"> are presented below. The key results are highlighted in bold and will be discussed further below.</w:t>
+        <w:t xml:space="preserve"> are presented below. </w:t>
+      </w:r>
+    </w:p>
+    <w:p/>
+    <w:p>
+      <w:pPr>
+        <w:pStyle w:val="Heading2"/>
+      </w:pPr>
+      <w:r>
+        <w:t>Foody et al. (2013)</w:t>
       </w:r>
     </w:p>
     <w:p>
@@ -152,6 +133,199 @@
       </w:r>
     </w:p>
     <w:p/>
+    <w:p>
+      <w:pPr>
+        <w:pStyle w:val="Heading2"/>
+      </w:pPr>
+      <w:r>
+        <w:t>Foody et al. (2015)</w:t>
+      </w:r>
+    </w:p>
+    <w:p>
+      <w:pPr>
+        <w:pStyle w:val="Heading3"/>
+      </w:pPr>
+      <w:r>
+        <w:t>Discomfort</w:t>
+      </w:r>
+    </w:p>
+    <w:p>
+      <w:pPr>
+        <w:ind w:firstLine="720"/>
+      </w:pPr>
+      <w:r>
+        <w:t xml:space="preserve">A mixed between–within 6 x 4 ANOVA revealed a highly significant main effect for time, Wilkes Lambda=.34, F(5, 40) =15.24, p=.000, partial eta squared=.66, that accounted for a large amount of the variance (66 %), but not for condition, F(3, 44)=.54, p=.66, partial eta squared=.04. In addition, </w:t>
+      </w:r>
+      <w:r>
+        <w:rPr>
+          <w:b/>
+          <w:bCs/>
+        </w:rPr>
+        <w:t>the interaction effect was not significant, Wilkes Lambda = .88, F(5, 42)=.58, p=.88, partial eta squared=.07.</w:t>
+      </w:r>
+    </w:p>
+    <w:p>
+      <w:pPr>
+        <w:pStyle w:val="Heading3"/>
+        <w:rPr>
+          <w:b w:val="0"/>
+          <w:bCs w:val="0"/>
+        </w:rPr>
+      </w:pPr>
+      <w:r>
+        <w:rPr>
+          <w:b w:val="0"/>
+          <w:bCs w:val="0"/>
+        </w:rPr>
+        <w:t>[collapsing across self and object conditions]</w:t>
+      </w:r>
+    </w:p>
+    <w:p>
+      <w:pPr>
+        <w:ind w:firstLine="720"/>
+        <w:rPr>
+          <w:b/>
+          <w:bCs/>
+        </w:rPr>
+      </w:pPr>
+      <w:r>
+        <w:lastRenderedPageBreak/>
+        <w:t xml:space="preserve">A mixed between–within subjects 6 x 2 analysis of variance was conducted to assess the impact of hierarchical and distinction interventions on discomfort ratings across the six time points. This revealed a highly significant main effect for time, Wilkes Lambda=.35, F(5, 42) =15.80, p=.000, partial eta squared=.65, that accounted for a large amount of the variance (65 %), but not for condition, F(1, 46)=.35, p =1.17, partial eta squared=.03. In addition, </w:t>
+      </w:r>
+      <w:r>
+        <w:rPr>
+          <w:b/>
+          <w:bCs/>
+        </w:rPr>
+        <w:t>the interaction effect was not significant, Wilkes Lambda = .97, F(5, 42)=.25, p=.94, partial eta squared=.03</w:t>
+      </w:r>
+      <w:r>
+        <w:rPr>
+          <w:b/>
+          <w:bCs/>
+        </w:rPr>
+        <w:t>.</w:t>
+      </w:r>
+    </w:p>
+    <w:p>
+      <w:pPr>
+        <w:pStyle w:val="Heading3"/>
+      </w:pPr>
+      <w:r>
+        <w:t>Anxiety</w:t>
+      </w:r>
+    </w:p>
+    <w:p>
+      <w:pPr>
+        <w:ind w:firstLine="720"/>
+        <w:rPr>
+          <w:b/>
+          <w:bCs/>
+        </w:rPr>
+      </w:pPr>
+      <w:r>
+        <w:t xml:space="preserve">A mixed between–within 6 x 4 ANOVA revealed a highly significant main effect for time, Wilkes Lambda=.43, F(5, 40) =10.44, p=.000, partial eta squared=.57, that accounted for a substantial amount of the variance (57 %), but not for condition, F(3, 44)=.77, p=.52, partial eta squared=.05, </w:t>
+      </w:r>
+      <w:r>
+        <w:rPr>
+          <w:b/>
+          <w:bCs/>
+        </w:rPr>
+        <w:t>or the interaction effect, Wilkes Lambda=.71, F(5, 42) =1, p=.47, partial eta squared=.11.</w:t>
+      </w:r>
+    </w:p>
+    <w:p>
+      <w:pPr>
+        <w:pStyle w:val="Heading3"/>
+        <w:rPr>
+          <w:b w:val="0"/>
+          <w:bCs w:val="0"/>
+        </w:rPr>
+      </w:pPr>
+      <w:r>
+        <w:rPr>
+          <w:b w:val="0"/>
+          <w:bCs w:val="0"/>
+        </w:rPr>
+        <w:t>[collapsing across self and object conditions]</w:t>
+      </w:r>
+    </w:p>
+    <w:p>
+      <w:pPr>
+        <w:ind w:firstLine="720"/>
+      </w:pPr>
+      <w:r>
+        <w:t xml:space="preserve">For anxiety ratings between the hierarchical and distinction conditions, a mixed between–within subjects analysis of variance revealed a highly significant main effect for time, Wilkes Lambda=.44, F(5, 42) =10.67, p=.000, partial eta squared=.56, but not for condition, F(1, 46) =2.04, p=.16, partial eta squared=.04. In addition, </w:t>
+      </w:r>
+      <w:r>
+        <w:rPr>
+          <w:b/>
+          <w:bCs/>
+        </w:rPr>
+        <w:t>the interaction effect was not significant, Wilkes Lambda=.93, F(5, 42)=.65, p=.67, partial eta squared=.07</w:t>
+      </w:r>
+      <w:r>
+        <w:t>.</w:t>
+      </w:r>
+    </w:p>
+    <w:p>
+      <w:pPr>
+        <w:pStyle w:val="Heading3"/>
+      </w:pPr>
+      <w:r>
+        <w:t>Stress</w:t>
+      </w:r>
+    </w:p>
+    <w:p>
+      <w:pPr>
+        <w:ind w:firstLine="720"/>
+        <w:rPr>
+          <w:b/>
+          <w:bCs/>
+        </w:rPr>
+      </w:pPr>
+      <w:r>
+        <w:t xml:space="preserve">A mixed between–within 6 x 4 ANOVA revealed a highly significant main effect for time, Wilkes Lambda=.52, F(5, 40) =7.5, p=.000, partial eta squared=.48, that accounted for a substantial amount of the variance (48 %), but not for condition, F(3, 43) =2.14, p=.11, partial eta squared=.12. </w:t>
+      </w:r>
+      <w:r>
+        <w:rPr>
+          <w:b/>
+          <w:bCs/>
+        </w:rPr>
+        <w:t>The interaction effect was not significant, Wilkes Lambda=.56, F(5, 42) =1.71, p=.059, partial eta squared=.17.</w:t>
+      </w:r>
+    </w:p>
+    <w:p>
+      <w:pPr>
+        <w:pStyle w:val="Heading3"/>
+        <w:rPr>
+          <w:b w:val="0"/>
+          <w:bCs w:val="0"/>
+        </w:rPr>
+      </w:pPr>
+      <w:r>
+        <w:rPr>
+          <w:b w:val="0"/>
+          <w:bCs w:val="0"/>
+        </w:rPr>
+        <w:t>[collapsing across self and object conditions]</w:t>
+      </w:r>
+    </w:p>
+    <w:p>
+      <w:pPr>
+        <w:ind w:firstLine="720"/>
+      </w:pPr>
+      <w:r>
+        <w:t xml:space="preserve">For stress ratings between the hierarchical and distinction conditions, a mixed between–within subjects analysis of variance revealed a highly significant main effect for time, Wilkes Lambda=.55, F(5, 42) =6.99, p=.000, partial eta squared=.45. Additionally, the main effect for condition was significant, F 1, 46) =4.98, p=.03, partial eta squared=.10. </w:t>
+      </w:r>
+      <w:r>
+        <w:rPr>
+          <w:b/>
+          <w:bCs/>
+        </w:rPr>
+        <w:t>The interaction effect was not significant, Wilkes Lambda=.90, F(5, 42)=.93, p=.47, partial eta squared=.10.</w:t>
+      </w:r>
+    </w:p>
     <w:sectPr>
       <w:pgSz w:w="11900" w:h="16840"/>
       <w:pgMar w:top="1440" w:right="1440" w:bottom="1440" w:left="1440" w:header="708" w:footer="708" w:gutter="0"/>
@@ -163,7 +337,7 @@
 </file>
 
 <file path=word/endnotes.xml><?xml version="1.0" encoding="utf-8"?>
-<w:endnotes xmlns:wpc="http://schemas.microsoft.com/office/word/2010/wordprocessingCanvas" xmlns:cx="http://schemas.microsoft.com/office/drawing/2014/chartex" xmlns:cx1="http://schemas.microsoft.com/office/drawing/2015/9/8/chartex" xmlns:cx2="http://schemas.microsoft.com/office/drawing/2015/10/21/chartex" xmlns:cx3="http://schemas.microsoft.com/office/drawing/2016/5/9/chartex" xmlns:cx4="http://schemas.microsoft.com/office/drawing/2016/5/10/chartex" xmlns:cx5="http://schemas.microsoft.com/office/drawing/2016/5/11/chartex" xmlns:cx6="http://schemas.microsoft.com/office/drawing/2016/5/12/chartex" xmlns:cx7="http://schemas.microsoft.com/office/drawing/2016/5/13/chartex" xmlns:cx8="http://schemas.microsoft.com/office/drawing/2016/5/14/chartex" xmlns:mc="http://schemas.openxmlformats.org/markup-compatibility/2006" xmlns:aink="http://schemas.microsoft.com/office/drawing/2016/ink" xmlns:am3d="http://schemas.microsoft.com/office/drawing/2017/model3d" xmlns:o="urn:schemas-microsoft-com:office:office" xmlns:oel="http://schemas.microsoft.com/office/2019/extlst" xmlns:r="http://schemas.openxmlformats.org/officeDocument/2006/relationships" xmlns:m="http://schemas.openxmlformats.org/officeDocument/2006/math" xmlns:v="urn:schemas-microsoft-com:vml" xmlns:wp14="http://schemas.microsoft.com/office/word/2010/wordprocessingDrawing" xmlns:wp="http://schemas.openxmlformats.org/drawingml/2006/wordprocessingDrawing" xmlns:w10="urn:schemas-microsoft-com:office:word" xmlns:w="http://schemas.openxmlformats.org/wordprocessingml/2006/main" xmlns:w14="http://schemas.microsoft.com/office/word/2010/wordml" xmlns:w15="http://schemas.microsoft.com/office/word/2012/wordml" xmlns:w16cex="http://schemas.microsoft.com/office/word/2018/wordml/cex" xmlns:w16cid="http://schemas.microsoft.com/office/word/2016/wordml/cid" xmlns:w16="http://schemas.microsoft.com/office/word/2018/wordml" xmlns:w16sdtdh="http://schemas.microsoft.com/office/word/2020/wordml/sdtdatahash" xmlns:w16se="http://schemas.microsoft.com/office/word/2015/wordml/symex" xmlns:wpg="http://schemas.microsoft.com/office/word/2010/wordprocessingGroup" xmlns:wpi="http://schemas.microsoft.com/office/word/2010/wordprocessingInk" xmlns:wne="http://schemas.microsoft.com/office/word/2006/wordml" xmlns:wps="http://schemas.microsoft.com/office/word/2010/wordprocessingShape" mc:Ignorable="w14 w15 w16se w16cid w16 w16cex w16sdtdh wp14">
+<w:endnotes xmlns:wpc="http://schemas.microsoft.com/office/word/2010/wordprocessingCanvas" xmlns:cx="http://schemas.microsoft.com/office/drawing/2014/chartex" xmlns:cx1="http://schemas.microsoft.com/office/drawing/2015/9/8/chartex" xmlns:cx2="http://schemas.microsoft.com/office/drawing/2015/10/21/chartex" xmlns:cx3="http://schemas.microsoft.com/office/drawing/2016/5/9/chartex" xmlns:cx4="http://schemas.microsoft.com/office/drawing/2016/5/10/chartex" xmlns:cx5="http://schemas.microsoft.com/office/drawing/2016/5/11/chartex" xmlns:cx6="http://schemas.microsoft.com/office/drawing/2016/5/12/chartex" xmlns:cx7="http://schemas.microsoft.com/office/drawing/2016/5/13/chartex" xmlns:cx8="http://schemas.microsoft.com/office/drawing/2016/5/14/chartex" xmlns:mc="http://schemas.openxmlformats.org/markup-compatibility/2006" xmlns:aink="http://schemas.microsoft.com/office/drawing/2016/ink" xmlns:am3d="http://schemas.microsoft.com/office/drawing/2017/model3d" xmlns:o="urn:schemas-microsoft-com:office:office" xmlns:oel="http://schemas.microsoft.com/office/2019/extlst" xmlns:r="http://schemas.openxmlformats.org/officeDocument/2006/relationships" xmlns:m="http://schemas.openxmlformats.org/officeDocument/2006/math" xmlns:v="urn:schemas-microsoft-com:vml" xmlns:wp14="http://schemas.microsoft.com/office/word/2010/wordprocessingDrawing" xmlns:wp="http://schemas.openxmlformats.org/drawingml/2006/wordprocessingDrawing" xmlns:w10="urn:schemas-microsoft-com:office:word" xmlns:w="http://schemas.openxmlformats.org/wordprocessingml/2006/main" xmlns:w14="http://schemas.microsoft.com/office/word/2010/wordml" xmlns:w15="http://schemas.microsoft.com/office/word/2012/wordml" xmlns:w16cex="http://schemas.microsoft.com/office/word/2018/wordml/cex" xmlns:w16cid="http://schemas.microsoft.com/office/word/2016/wordml/cid" xmlns:w16="http://schemas.microsoft.com/office/word/2018/wordml" xmlns:w16du="http://schemas.microsoft.com/office/word/2023/wordml/word16du" xmlns:w16sdtdh="http://schemas.microsoft.com/office/word/2020/wordml/sdtdatahash" xmlns:w16sdtfl="http://schemas.microsoft.com/office/word/2024/wordml/sdtformatlock" xmlns:w16se="http://schemas.microsoft.com/office/word/2015/wordml/symex" xmlns:wpg="http://schemas.microsoft.com/office/word/2010/wordprocessingGroup" xmlns:wpi="http://schemas.microsoft.com/office/word/2010/wordprocessingInk" xmlns:wne="http://schemas.microsoft.com/office/word/2006/wordml" xmlns:wps="http://schemas.microsoft.com/office/word/2010/wordprocessingShape" mc:Ignorable="w14 w15 w16se w16cid w16 w16cex w16sdtdh w16sdtfl w16du wp14">
   <w:endnote w:type="separator" w:id="-1">
     <w:p>
       <w:r>
@@ -182,7 +356,7 @@
 </file>
 
 <file path=word/footnotes.xml><?xml version="1.0" encoding="utf-8"?>
-<w:footnotes xmlns:wpc="http://schemas.microsoft.com/office/word/2010/wordprocessingCanvas" xmlns:cx="http://schemas.microsoft.com/office/drawing/2014/chartex" xmlns:cx1="http://schemas.microsoft.com/office/drawing/2015/9/8/chartex" xmlns:cx2="http://schemas.microsoft.com/office/drawing/2015/10/21/chartex" xmlns:cx3="http://schemas.microsoft.com/office/drawing/2016/5/9/chartex" xmlns:cx4="http://schemas.microsoft.com/office/drawing/2016/5/10/chartex" xmlns:cx5="http://schemas.microsoft.com/office/drawing/2016/5/11/chartex" xmlns:cx6="http://schemas.microsoft.com/office/drawing/2016/5/12/chartex" xmlns:cx7="http://schemas.microsoft.com/office/drawing/2016/5/13/chartex" xmlns:cx8="http://schemas.microsoft.com/office/drawing/2016/5/14/chartex" xmlns:mc="http://schemas.openxmlformats.org/markup-compatibility/2006" xmlns:aink="http://schemas.microsoft.com/office/drawing/2016/ink" xmlns:am3d="http://schemas.microsoft.com/office/drawing/2017/model3d" xmlns:o="urn:schemas-microsoft-com:office:office" xmlns:oel="http://schemas.microsoft.com/office/2019/extlst" xmlns:r="http://schemas.openxmlformats.org/officeDocument/2006/relationships" xmlns:m="http://schemas.openxmlformats.org/officeDocument/2006/math" xmlns:v="urn:schemas-microsoft-com:vml" xmlns:wp14="http://schemas.microsoft.com/office/word/2010/wordprocessingDrawing" xmlns:wp="http://schemas.openxmlformats.org/drawingml/2006/wordprocessingDrawing" xmlns:w10="urn:schemas-microsoft-com:office:word" xmlns:w="http://schemas.openxmlformats.org/wordprocessingml/2006/main" xmlns:w14="http://schemas.microsoft.com/office/word/2010/wordml" xmlns:w15="http://schemas.microsoft.com/office/word/2012/wordml" xmlns:w16cex="http://schemas.microsoft.com/office/word/2018/wordml/cex" xmlns:w16cid="http://schemas.microsoft.com/office/word/2016/wordml/cid" xmlns:w16="http://schemas.microsoft.com/office/word/2018/wordml" xmlns:w16sdtdh="http://schemas.microsoft.com/office/word/2020/wordml/sdtdatahash" xmlns:w16se="http://schemas.microsoft.com/office/word/2015/wordml/symex" xmlns:wpg="http://schemas.microsoft.com/office/word/2010/wordprocessingGroup" xmlns:wpi="http://schemas.microsoft.com/office/word/2010/wordprocessingInk" xmlns:wne="http://schemas.microsoft.com/office/word/2006/wordml" xmlns:wps="http://schemas.microsoft.com/office/word/2010/wordprocessingShape" mc:Ignorable="w14 w15 w16se w16cid w16 w16cex w16sdtdh wp14">
+<w:footnotes xmlns:wpc="http://schemas.microsoft.com/office/word/2010/wordprocessingCanvas" xmlns:cx="http://schemas.microsoft.com/office/drawing/2014/chartex" xmlns:cx1="http://schemas.microsoft.com/office/drawing/2015/9/8/chartex" xmlns:cx2="http://schemas.microsoft.com/office/drawing/2015/10/21/chartex" xmlns:cx3="http://schemas.microsoft.com/office/drawing/2016/5/9/chartex" xmlns:cx4="http://schemas.microsoft.com/office/drawing/2016/5/10/chartex" xmlns:cx5="http://schemas.microsoft.com/office/drawing/2016/5/11/chartex" xmlns:cx6="http://schemas.microsoft.com/office/drawing/2016/5/12/chartex" xmlns:cx7="http://schemas.microsoft.com/office/drawing/2016/5/13/chartex" xmlns:cx8="http://schemas.microsoft.com/office/drawing/2016/5/14/chartex" xmlns:mc="http://schemas.openxmlformats.org/markup-compatibility/2006" xmlns:aink="http://schemas.microsoft.com/office/drawing/2016/ink" xmlns:am3d="http://schemas.microsoft.com/office/drawing/2017/model3d" xmlns:o="urn:schemas-microsoft-com:office:office" xmlns:oel="http://schemas.microsoft.com/office/2019/extlst" xmlns:r="http://schemas.openxmlformats.org/officeDocument/2006/relationships" xmlns:m="http://schemas.openxmlformats.org/officeDocument/2006/math" xmlns:v="urn:schemas-microsoft-com:vml" xmlns:wp14="http://schemas.microsoft.com/office/word/2010/wordprocessingDrawing" xmlns:wp="http://schemas.openxmlformats.org/drawingml/2006/wordprocessingDrawing" xmlns:w10="urn:schemas-microsoft-com:office:word" xmlns:w="http://schemas.openxmlformats.org/wordprocessingml/2006/main" xmlns:w14="http://schemas.microsoft.com/office/word/2010/wordml" xmlns:w15="http://schemas.microsoft.com/office/word/2012/wordml" xmlns:w16cex="http://schemas.microsoft.com/office/word/2018/wordml/cex" xmlns:w16cid="http://schemas.microsoft.com/office/word/2016/wordml/cid" xmlns:w16="http://schemas.microsoft.com/office/word/2018/wordml" xmlns:w16du="http://schemas.microsoft.com/office/word/2023/wordml/word16du" xmlns:w16sdtdh="http://schemas.microsoft.com/office/word/2020/wordml/sdtdatahash" xmlns:w16sdtfl="http://schemas.microsoft.com/office/word/2024/wordml/sdtformatlock" xmlns:w16se="http://schemas.microsoft.com/office/word/2015/wordml/symex" xmlns:wpg="http://schemas.microsoft.com/office/word/2010/wordprocessingGroup" xmlns:wpi="http://schemas.microsoft.com/office/word/2010/wordprocessingInk" xmlns:wne="http://schemas.microsoft.com/office/word/2006/wordml" xmlns:wps="http://schemas.microsoft.com/office/word/2010/wordprocessingShape" mc:Ignorable="w14 w15 w16se w16cid w16 w16cex w16sdtdh w16sdtfl w16du wp14">
   <w:footnote w:type="separator" w:id="-1">
     <w:p>
       <w:r>
@@ -201,7 +375,7 @@
 </file>
 
 <file path=word/numbering.xml><?xml version="1.0" encoding="utf-8"?>
-<w:numbering xmlns:wpc="http://schemas.microsoft.com/office/word/2010/wordprocessingCanvas" xmlns:cx="http://schemas.microsoft.com/office/drawing/2014/chartex" xmlns:cx1="http://schemas.microsoft.com/office/drawing/2015/9/8/chartex" xmlns:cx2="http://schemas.microsoft.com/office/drawing/2015/10/21/chartex" xmlns:cx3="http://schemas.microsoft.com/office/drawing/2016/5/9/chartex" xmlns:cx4="http://schemas.microsoft.com/office/drawing/2016/5/10/chartex" xmlns:cx5="http://schemas.microsoft.com/office/drawing/2016/5/11/chartex" xmlns:cx6="http://schemas.microsoft.com/office/drawing/2016/5/12/chartex" xmlns:cx7="http://schemas.microsoft.com/office/drawing/2016/5/13/chartex" xmlns:cx8="http://schemas.microsoft.com/office/drawing/2016/5/14/chartex" xmlns:mc="http://schemas.openxmlformats.org/markup-compatibility/2006" xmlns:aink="http://schemas.microsoft.com/office/drawing/2016/ink" xmlns:am3d="http://schemas.microsoft.com/office/drawing/2017/model3d" xmlns:o="urn:schemas-microsoft-com:office:office" xmlns:oel="http://schemas.microsoft.com/office/2019/extlst" xmlns:r="http://schemas.openxmlformats.org/officeDocument/2006/relationships" xmlns:m="http://schemas.openxmlformats.org/officeDocument/2006/math" xmlns:v="urn:schemas-microsoft-com:vml" xmlns:wp14="http://schemas.microsoft.com/office/word/2010/wordprocessingDrawing" xmlns:wp="http://schemas.openxmlformats.org/drawingml/2006/wordprocessingDrawing" xmlns:w10="urn:schemas-microsoft-com:office:word" xmlns:w="http://schemas.openxmlformats.org/wordprocessingml/2006/main" xmlns:w14="http://schemas.microsoft.com/office/word/2010/wordml" xmlns:w15="http://schemas.microsoft.com/office/word/2012/wordml" xmlns:w16cex="http://schemas.microsoft.com/office/word/2018/wordml/cex" xmlns:w16cid="http://schemas.microsoft.com/office/word/2016/wordml/cid" xmlns:w16="http://schemas.microsoft.com/office/word/2018/wordml" xmlns:w16sdtdh="http://schemas.microsoft.com/office/word/2020/wordml/sdtdatahash" xmlns:w16se="http://schemas.microsoft.com/office/word/2015/wordml/symex" xmlns:wpg="http://schemas.microsoft.com/office/word/2010/wordprocessingGroup" xmlns:wpi="http://schemas.microsoft.com/office/word/2010/wordprocessingInk" xmlns:wne="http://schemas.microsoft.com/office/word/2006/wordml" xmlns:wps="http://schemas.microsoft.com/office/word/2010/wordprocessingShape" mc:Ignorable="w14 w15 w16se w16cid w16 w16cex w16sdtdh wp14">
+<w:numbering xmlns:wpc="http://schemas.microsoft.com/office/word/2010/wordprocessingCanvas" xmlns:cx="http://schemas.microsoft.com/office/drawing/2014/chartex" xmlns:cx1="http://schemas.microsoft.com/office/drawing/2015/9/8/chartex" xmlns:cx2="http://schemas.microsoft.com/office/drawing/2015/10/21/chartex" xmlns:cx3="http://schemas.microsoft.com/office/drawing/2016/5/9/chartex" xmlns:cx4="http://schemas.microsoft.com/office/drawing/2016/5/10/chartex" xmlns:cx5="http://schemas.microsoft.com/office/drawing/2016/5/11/chartex" xmlns:cx6="http://schemas.microsoft.com/office/drawing/2016/5/12/chartex" xmlns:cx7="http://schemas.microsoft.com/office/drawing/2016/5/13/chartex" xmlns:cx8="http://schemas.microsoft.com/office/drawing/2016/5/14/chartex" xmlns:mc="http://schemas.openxmlformats.org/markup-compatibility/2006" xmlns:aink="http://schemas.microsoft.com/office/drawing/2016/ink" xmlns:am3d="http://schemas.microsoft.com/office/drawing/2017/model3d" xmlns:o="urn:schemas-microsoft-com:office:office" xmlns:oel="http://schemas.microsoft.com/office/2019/extlst" xmlns:r="http://schemas.openxmlformats.org/officeDocument/2006/relationships" xmlns:m="http://schemas.openxmlformats.org/officeDocument/2006/math" xmlns:v="urn:schemas-microsoft-com:vml" xmlns:wp14="http://schemas.microsoft.com/office/word/2010/wordprocessingDrawing" xmlns:wp="http://schemas.openxmlformats.org/drawingml/2006/wordprocessingDrawing" xmlns:w10="urn:schemas-microsoft-com:office:word" xmlns:w="http://schemas.openxmlformats.org/wordprocessingml/2006/main" xmlns:w14="http://schemas.microsoft.com/office/word/2010/wordml" xmlns:w15="http://schemas.microsoft.com/office/word/2012/wordml" xmlns:w16cex="http://schemas.microsoft.com/office/word/2018/wordml/cex" xmlns:w16cid="http://schemas.microsoft.com/office/word/2016/wordml/cid" xmlns:w16="http://schemas.microsoft.com/office/word/2018/wordml" xmlns:w16du="http://schemas.microsoft.com/office/word/2023/wordml/word16du" xmlns:w16sdtdh="http://schemas.microsoft.com/office/word/2020/wordml/sdtdatahash" xmlns:w16sdtfl="http://schemas.microsoft.com/office/word/2024/wordml/sdtformatlock" xmlns:w16se="http://schemas.microsoft.com/office/word/2015/wordml/symex" xmlns:wpg="http://schemas.microsoft.com/office/word/2010/wordprocessingGroup" xmlns:wpi="http://schemas.microsoft.com/office/word/2010/wordprocessingInk" xmlns:wne="http://schemas.microsoft.com/office/word/2006/wordml" xmlns:wps="http://schemas.microsoft.com/office/word/2010/wordprocessingShape" mc:Ignorable="w14 w15 w16se w16cid w16 w16cex w16sdtdh w16sdtfl w16du wp14">
   <w:abstractNum w:abstractNumId="0" w15:restartNumberingAfterBreak="0">
     <w:nsid w:val="0C4E3B18"/>
     <w:multiLevelType w:val="multilevel"/>
@@ -662,7 +836,7 @@
 </file>
 
 <file path=word/styles.xml><?xml version="1.0" encoding="utf-8"?>
-<w:styles xmlns:mc="http://schemas.openxmlformats.org/markup-compatibility/2006" xmlns:r="http://schemas.openxmlformats.org/officeDocument/2006/relationships" xmlns:w="http://schemas.openxmlformats.org/wordprocessingml/2006/main" xmlns:w14="http://schemas.microsoft.com/office/word/2010/wordml" xmlns:w15="http://schemas.microsoft.com/office/word/2012/wordml" xmlns:w16cex="http://schemas.microsoft.com/office/word/2018/wordml/cex" xmlns:w16cid="http://schemas.microsoft.com/office/word/2016/wordml/cid" xmlns:w16="http://schemas.microsoft.com/office/word/2018/wordml" xmlns:w16sdtdh="http://schemas.microsoft.com/office/word/2020/wordml/sdtdatahash" xmlns:w16se="http://schemas.microsoft.com/office/word/2015/wordml/symex" mc:Ignorable="w14 w15 w16se w16cid w16 w16cex w16sdtdh">
+<w:styles xmlns:mc="http://schemas.openxmlformats.org/markup-compatibility/2006" xmlns:r="http://schemas.openxmlformats.org/officeDocument/2006/relationships" xmlns:w="http://schemas.openxmlformats.org/wordprocessingml/2006/main" xmlns:w14="http://schemas.microsoft.com/office/word/2010/wordml" xmlns:w15="http://schemas.microsoft.com/office/word/2012/wordml" xmlns:w16cex="http://schemas.microsoft.com/office/word/2018/wordml/cex" xmlns:w16cid="http://schemas.microsoft.com/office/word/2016/wordml/cid" xmlns:w16="http://schemas.microsoft.com/office/word/2018/wordml" xmlns:w16du="http://schemas.microsoft.com/office/word/2023/wordml/word16du" xmlns:w16sdtdh="http://schemas.microsoft.com/office/word/2020/wordml/sdtdatahash" xmlns:w16sdtfl="http://schemas.microsoft.com/office/word/2024/wordml/sdtformatlock" xmlns:w16se="http://schemas.microsoft.com/office/word/2015/wordml/symex" mc:Ignorable="w14 w15 w16se w16cid w16 w16cex w16sdtdh w16sdtfl w16du">
   <w:docDefaults>
     <w:rPrDefault>
       <w:rPr>

</xml_diff>